<commit_message>
Refactor project to token auth and booking flow
</commit_message>
<xml_diff>
--- a/dokumentacija/TestPlan_IzvestajTestiranja_azuriran.docx
+++ b/dokumentacija/TestPlan_IzvestajTestiranja_azuriran.docx
@@ -7990,7 +7990,7 @@
     </w:p>
     <w:p>
       <w:r>
-        <w:t>Proces 1: Prijavljivanje i registracija. Proces 2: Zakazivanje termina i pregled rasporeda.</w:t>
+        <w:t>Proces 1: Prijavljivanje i registracija. Proces 2: Zakazivanje termina .</w:t>
       </w:r>
     </w:p>
     <w:p>
@@ -10678,12 +10678,13 @@
             <w:tcW w:type="dxa" w:w="1308"/>
           </w:tcPr>
           <w:p>
-            <w:r/>
-            <w:r>
-              <w:rPr>
-                <w:sz w:val="16"/>
-              </w:rPr>
-              <w:t>GET dostupni termini, POST /api/termini.</w:t>
+            <w:r>
+              <w:t>GET dostupni termini, POST /api/zakazivanje/termini.</w:t>
+            </w:r>
+            <w:r>
+              <w:rPr>
+                <w:sz w:val="16"/>
+              </w:rPr>
             </w:r>
           </w:p>
         </w:tc>
@@ -10792,12 +10793,13 @@
             <w:tcW w:type="dxa" w:w="1308"/>
           </w:tcPr>
           <w:p>
-            <w:r/>
-            <w:r>
-              <w:rPr>
-                <w:sz w:val="16"/>
-              </w:rPr>
-              <w:t>POST /api/termini sa datumom od juce.</w:t>
+            <w:r>
+              <w:t>POST /api/zakazivanje/termini sa datumom od juce.</w:t>
+            </w:r>
+            <w:r>
+              <w:rPr>
+                <w:sz w:val="16"/>
+              </w:rPr>
             </w:r>
           </w:p>
         </w:tc>
@@ -11248,12 +11250,13 @@
             <w:tcW w:type="dxa" w:w="1308"/>
           </w:tcPr>
           <w:p>
-            <w:r/>
-            <w:r>
-              <w:rPr>
-                <w:sz w:val="16"/>
-              </w:rPr>
-              <w:t>GET /api/termini/zaposleni/{id}.</w:t>
+            <w:r>
+              <w:t>GET /api/zakazivanje/opcije.</w:t>
+            </w:r>
+            <w:r>
+              <w:rPr>
+                <w:sz w:val="16"/>
+              </w:rPr>
             </w:r>
           </w:p>
         </w:tc>
@@ -11353,10 +11356,10 @@
             <w:tcW w:type="dxa" w:w="1308"/>
           </w:tcPr>
           <w:p>
-            <w:r/>
-            <w:r>
-              <w:t>POST /api/termini sa danasnjim datumom i vremenom koje je vec proslo.</w:t>
-            </w:r>
+            <w:r>
+              <w:t>POST /api/zakazivanje/termini sa danasnjim datumom i vremenom koje je vec proslo.</w:t>
+            </w:r>
+            <w:r/>
           </w:p>
         </w:tc>
         <w:tc>
@@ -11443,10 +11446,10 @@
             <w:tcW w:type="dxa" w:w="1308"/>
           </w:tcPr>
           <w:p>
-            <w:r/>
-            <w:r>
-              <w:t>POST /api/termini sa vremenom 07:30.</w:t>
-            </w:r>
+            <w:r>
+              <w:t>POST /api/zakazivanje/termini sa vremenom 07:30.</w:t>
+            </w:r>
+            <w:r/>
           </w:p>
         </w:tc>
         <w:tc>
@@ -11533,10 +11536,10 @@
             <w:tcW w:type="dxa" w:w="1308"/>
           </w:tcPr>
           <w:p>
-            <w:r/>
-            <w:r>
-              <w:t>POST /api/termini sa pocetkom 20:00.</w:t>
-            </w:r>
+            <w:r>
+              <w:t>POST /api/zakazivanje/termini sa pocetkom 20:00.</w:t>
+            </w:r>
+            <w:r/>
           </w:p>
         </w:tc>
         <w:tc>
@@ -11623,10 +11626,10 @@
             <w:tcW w:type="dxa" w:w="1308"/>
           </w:tcPr>
           <w:p>
-            <w:r/>
-            <w:r>
-              <w:t>POST /api/termini sa vremenom 08:00.</w:t>
-            </w:r>
+            <w:r>
+              <w:t>POST /api/zakazivanje/termini sa vremenom 08:00.</w:t>
+            </w:r>
+            <w:r/>
           </w:p>
         </w:tc>
         <w:tc>
@@ -11713,10 +11716,10 @@
             <w:tcW w:type="dxa" w:w="1308"/>
           </w:tcPr>
           <w:p>
-            <w:r/>
-            <w:r>
-              <w:t>GET /api/dostupni-termini za danas i proveriti prvi ponudjeni slot.</w:t>
-            </w:r>
+            <w:r>
+              <w:t>GET /api/zakazivanje/dostupni-termini za danas i proveriti prvi ponudjeni slot.</w:t>
+            </w:r>
+            <w:r/>
           </w:p>
         </w:tc>
         <w:tc>
@@ -11891,12 +11894,13 @@
             <w:tcW w:type="dxa" w:w="5233"/>
           </w:tcPr>
           <w:p>
-            <w:r/>
-            <w:r>
-              <w:rPr>
-                <w:sz w:val="16"/>
-              </w:rPr>
-              <w:t>GET /api/usluge</w:t>
+            <w:r>
+              <w:t>GET /api/zakazivanje/opcije</w:t>
+            </w:r>
+            <w:r>
+              <w:rPr>
+                <w:sz w:val="16"/>
+              </w:rPr>
             </w:r>
           </w:p>
         </w:tc>
@@ -11921,12 +11925,13 @@
             <w:tcW w:type="dxa" w:w="5233"/>
           </w:tcPr>
           <w:p>
-            <w:r/>
-            <w:r>
-              <w:rPr>
-                <w:sz w:val="16"/>
-              </w:rPr>
-              <w:t>POST /api/termini</w:t>
+            <w:r>
+              <w:t>POST /api/zakazivanje/termini</w:t>
+            </w:r>
+            <w:r>
+              <w:rPr>
+                <w:sz w:val="16"/>
+              </w:rPr>
             </w:r>
           </w:p>
         </w:tc>
@@ -11951,12 +11956,13 @@
             <w:tcW w:type="dxa" w:w="5233"/>
           </w:tcPr>
           <w:p>
-            <w:r/>
-            <w:r>
-              <w:rPr>
-                <w:sz w:val="16"/>
-              </w:rPr>
-              <w:t>GET /api/termini/klijent/{id}</w:t>
+            <w:r>
+              <w:t>GET /api/user</w:t>
+            </w:r>
+            <w:r>
+              <w:rPr>
+                <w:sz w:val="16"/>
+              </w:rPr>
             </w:r>
           </w:p>
         </w:tc>
@@ -11981,12 +11987,13 @@
             <w:tcW w:type="dxa" w:w="5233"/>
           </w:tcPr>
           <w:p>
-            <w:r/>
-            <w:r>
-              <w:rPr>
-                <w:sz w:val="16"/>
-              </w:rPr>
-              <w:t>GET /api/termini/zaposleni/{id}</w:t>
+            <w:r>
+              <w:t>GET /api/zakazivanje/opcije</w:t>
+            </w:r>
+            <w:r>
+              <w:rPr>
+                <w:sz w:val="16"/>
+              </w:rPr>
             </w:r>
           </w:p>
         </w:tc>
@@ -12011,12 +12018,13 @@
             <w:tcW w:type="dxa" w:w="5233"/>
           </w:tcPr>
           <w:p>
-            <w:r/>
-            <w:r>
-              <w:rPr>
-                <w:sz w:val="16"/>
-              </w:rPr>
-              <w:t>PUT /api/termini/{id}</w:t>
+            <w:r>
+              <w:t>GET /api/zakazivanje/dostupni-termini</w:t>
+            </w:r>
+            <w:r>
+              <w:rPr>
+                <w:sz w:val="16"/>
+              </w:rPr>
             </w:r>
           </w:p>
         </w:tc>
@@ -12041,12 +12049,13 @@
             <w:tcW w:type="dxa" w:w="5233"/>
           </w:tcPr>
           <w:p>
-            <w:r/>
-            <w:r>
-              <w:rPr>
-                <w:sz w:val="16"/>
-              </w:rPr>
-              <w:t>DELETE /api/termini/{id}</w:t>
+            <w:r>
+              <w:t>POST /api/zakazivanje/termini</w:t>
+            </w:r>
+            <w:r>
+              <w:rPr>
+                <w:sz w:val="16"/>
+              </w:rPr>
             </w:r>
           </w:p>
         </w:tc>
@@ -12071,10 +12080,10 @@
             <w:tcW w:type="dxa" w:w="5233"/>
           </w:tcPr>
           <w:p>
-            <w:r/>
-            <w:r>
-              <w:t>GET /api/dostupni-termini</w:t>
-            </w:r>
+            <w:r>
+              <w:t>GET /api/zakazivanje/dostupni-termini</w:t>
+            </w:r>
+            <w:r/>
           </w:p>
         </w:tc>
         <w:tc>
@@ -12113,6 +12122,14 @@
     <w:p>
       <w:r>
         <w:t>Azuriranje validacije zakazivanja termina (20.06.2026): dodati su testovi TC-13 do TC-17 za zabranu zakazivanja u proslosti i van radnog vremena 08:00-20:00. Svi novi testovi su prosli.</w:t>
+      </w:r>
+    </w:p>
+    <w:p>
+      <w:r>
+        <w:rPr>
+          <w:b/>
+        </w:rPr>
+        <w:t>Završna provera 14.07.2026: 15 automatizovanih testova, 55 assertiona i 0 padova; browser smoke test je potvrdio registraciju, prijavu, token guard, učitavanje slobodnih slotova i uspešno zakazivanje. Testni korisnik i termin su zatim uklonjeni.</w:t>
       </w:r>
     </w:p>
     <w:sectPr>

</xml_diff>

<commit_message>
Restore Laravel app and keep Angular cleanup
</commit_message>
<xml_diff>
--- a/dokumentacija/TestPlan_IzvestajTestiranja_azuriran.docx
+++ b/dokumentacija/TestPlan_IzvestajTestiranja_azuriran.docx
@@ -7990,7 +7990,7 @@
     </w:p>
     <w:p>
       <w:r>
-        <w:t>Proces 1: Prijavljivanje i registracija. Proces 2: Zakazivanje termina .</w:t>
+        <w:t>Proces 1: Prijavljivanje i registracija. Proces 2: Zakazivanje termina i pregled rasporeda.</w:t>
       </w:r>
     </w:p>
     <w:p>
@@ -10678,13 +10678,12 @@
             <w:tcW w:type="dxa" w:w="1308"/>
           </w:tcPr>
           <w:p>
-            <w:r>
-              <w:t>GET dostupni termini, POST /api/zakazivanje/termini.</w:t>
-            </w:r>
-            <w:r>
-              <w:rPr>
-                <w:sz w:val="16"/>
-              </w:rPr>
+            <w:r/>
+            <w:r>
+              <w:rPr>
+                <w:sz w:val="16"/>
+              </w:rPr>
+              <w:t>GET dostupni termini, POST /api/termini.</w:t>
             </w:r>
           </w:p>
         </w:tc>
@@ -10793,13 +10792,12 @@
             <w:tcW w:type="dxa" w:w="1308"/>
           </w:tcPr>
           <w:p>
-            <w:r>
-              <w:t>POST /api/zakazivanje/termini sa datumom od juce.</w:t>
-            </w:r>
-            <w:r>
-              <w:rPr>
-                <w:sz w:val="16"/>
-              </w:rPr>
+            <w:r/>
+            <w:r>
+              <w:rPr>
+                <w:sz w:val="16"/>
+              </w:rPr>
+              <w:t>POST /api/termini sa datumom od juce.</w:t>
             </w:r>
           </w:p>
         </w:tc>
@@ -11250,13 +11248,12 @@
             <w:tcW w:type="dxa" w:w="1308"/>
           </w:tcPr>
           <w:p>
-            <w:r>
-              <w:t>GET /api/zakazivanje/opcije.</w:t>
-            </w:r>
-            <w:r>
-              <w:rPr>
-                <w:sz w:val="16"/>
-              </w:rPr>
+            <w:r/>
+            <w:r>
+              <w:rPr>
+                <w:sz w:val="16"/>
+              </w:rPr>
+              <w:t>GET /api/termini/zaposleni/{id}.</w:t>
             </w:r>
           </w:p>
         </w:tc>
@@ -11356,10 +11353,10 @@
             <w:tcW w:type="dxa" w:w="1308"/>
           </w:tcPr>
           <w:p>
-            <w:r>
-              <w:t>POST /api/zakazivanje/termini sa danasnjim datumom i vremenom koje je vec proslo.</w:t>
-            </w:r>
-            <w:r/>
+            <w:r/>
+            <w:r>
+              <w:t>POST /api/termini sa danasnjim datumom i vremenom koje je vec proslo.</w:t>
+            </w:r>
           </w:p>
         </w:tc>
         <w:tc>
@@ -11446,10 +11443,10 @@
             <w:tcW w:type="dxa" w:w="1308"/>
           </w:tcPr>
           <w:p>
-            <w:r>
-              <w:t>POST /api/zakazivanje/termini sa vremenom 07:30.</w:t>
-            </w:r>
-            <w:r/>
+            <w:r/>
+            <w:r>
+              <w:t>POST /api/termini sa vremenom 07:30.</w:t>
+            </w:r>
           </w:p>
         </w:tc>
         <w:tc>
@@ -11536,10 +11533,10 @@
             <w:tcW w:type="dxa" w:w="1308"/>
           </w:tcPr>
           <w:p>
-            <w:r>
-              <w:t>POST /api/zakazivanje/termini sa pocetkom 20:00.</w:t>
-            </w:r>
-            <w:r/>
+            <w:r/>
+            <w:r>
+              <w:t>POST /api/termini sa pocetkom 20:00.</w:t>
+            </w:r>
           </w:p>
         </w:tc>
         <w:tc>
@@ -11626,10 +11623,10 @@
             <w:tcW w:type="dxa" w:w="1308"/>
           </w:tcPr>
           <w:p>
-            <w:r>
-              <w:t>POST /api/zakazivanje/termini sa vremenom 08:00.</w:t>
-            </w:r>
-            <w:r/>
+            <w:r/>
+            <w:r>
+              <w:t>POST /api/termini sa vremenom 08:00.</w:t>
+            </w:r>
           </w:p>
         </w:tc>
         <w:tc>
@@ -11716,10 +11713,10 @@
             <w:tcW w:type="dxa" w:w="1308"/>
           </w:tcPr>
           <w:p>
-            <w:r>
-              <w:t>GET /api/zakazivanje/dostupni-termini za danas i proveriti prvi ponudjeni slot.</w:t>
-            </w:r>
-            <w:r/>
+            <w:r/>
+            <w:r>
+              <w:t>GET /api/dostupni-termini za danas i proveriti prvi ponudjeni slot.</w:t>
+            </w:r>
           </w:p>
         </w:tc>
         <w:tc>
@@ -11894,13 +11891,12 @@
             <w:tcW w:type="dxa" w:w="5233"/>
           </w:tcPr>
           <w:p>
-            <w:r>
-              <w:t>GET /api/zakazivanje/opcije</w:t>
-            </w:r>
-            <w:r>
-              <w:rPr>
-                <w:sz w:val="16"/>
-              </w:rPr>
+            <w:r/>
+            <w:r>
+              <w:rPr>
+                <w:sz w:val="16"/>
+              </w:rPr>
+              <w:t>GET /api/usluge</w:t>
             </w:r>
           </w:p>
         </w:tc>
@@ -11925,13 +11921,12 @@
             <w:tcW w:type="dxa" w:w="5233"/>
           </w:tcPr>
           <w:p>
-            <w:r>
-              <w:t>POST /api/zakazivanje/termini</w:t>
-            </w:r>
-            <w:r>
-              <w:rPr>
-                <w:sz w:val="16"/>
-              </w:rPr>
+            <w:r/>
+            <w:r>
+              <w:rPr>
+                <w:sz w:val="16"/>
+              </w:rPr>
+              <w:t>POST /api/termini</w:t>
             </w:r>
           </w:p>
         </w:tc>
@@ -11956,13 +11951,12 @@
             <w:tcW w:type="dxa" w:w="5233"/>
           </w:tcPr>
           <w:p>
-            <w:r>
-              <w:t>GET /api/user</w:t>
-            </w:r>
-            <w:r>
-              <w:rPr>
-                <w:sz w:val="16"/>
-              </w:rPr>
+            <w:r/>
+            <w:r>
+              <w:rPr>
+                <w:sz w:val="16"/>
+              </w:rPr>
+              <w:t>GET /api/termini/klijent/{id}</w:t>
             </w:r>
           </w:p>
         </w:tc>
@@ -11987,13 +11981,12 @@
             <w:tcW w:type="dxa" w:w="5233"/>
           </w:tcPr>
           <w:p>
-            <w:r>
-              <w:t>GET /api/zakazivanje/opcije</w:t>
-            </w:r>
-            <w:r>
-              <w:rPr>
-                <w:sz w:val="16"/>
-              </w:rPr>
+            <w:r/>
+            <w:r>
+              <w:rPr>
+                <w:sz w:val="16"/>
+              </w:rPr>
+              <w:t>GET /api/termini/zaposleni/{id}</w:t>
             </w:r>
           </w:p>
         </w:tc>
@@ -12018,13 +12011,12 @@
             <w:tcW w:type="dxa" w:w="5233"/>
           </w:tcPr>
           <w:p>
-            <w:r>
-              <w:t>GET /api/zakazivanje/dostupni-termini</w:t>
-            </w:r>
-            <w:r>
-              <w:rPr>
-                <w:sz w:val="16"/>
-              </w:rPr>
+            <w:r/>
+            <w:r>
+              <w:rPr>
+                <w:sz w:val="16"/>
+              </w:rPr>
+              <w:t>PUT /api/termini/{id}</w:t>
             </w:r>
           </w:p>
         </w:tc>
@@ -12049,13 +12041,12 @@
             <w:tcW w:type="dxa" w:w="5233"/>
           </w:tcPr>
           <w:p>
-            <w:r>
-              <w:t>POST /api/zakazivanje/termini</w:t>
-            </w:r>
-            <w:r>
-              <w:rPr>
-                <w:sz w:val="16"/>
-              </w:rPr>
+            <w:r/>
+            <w:r>
+              <w:rPr>
+                <w:sz w:val="16"/>
+              </w:rPr>
+              <w:t>DELETE /api/termini/{id}</w:t>
             </w:r>
           </w:p>
         </w:tc>
@@ -12080,10 +12071,10 @@
             <w:tcW w:type="dxa" w:w="5233"/>
           </w:tcPr>
           <w:p>
-            <w:r>
-              <w:t>GET /api/zakazivanje/dostupni-termini</w:t>
-            </w:r>
-            <w:r/>
+            <w:r/>
+            <w:r>
+              <w:t>GET /api/dostupni-termini</w:t>
+            </w:r>
           </w:p>
         </w:tc>
         <w:tc>
@@ -12122,14 +12113,6 @@
     <w:p>
       <w:r>
         <w:t>Azuriranje validacije zakazivanja termina (20.06.2026): dodati su testovi TC-13 do TC-17 za zabranu zakazivanja u proslosti i van radnog vremena 08:00-20:00. Svi novi testovi su prosli.</w:t>
-      </w:r>
-    </w:p>
-    <w:p>
-      <w:r>
-        <w:rPr>
-          <w:b/>
-        </w:rPr>
-        <w:t>Završna provera 14.07.2026: 15 automatizovanih testova, 55 assertiona i 0 padova; browser smoke test je potvrdio registraciju, prijavu, token guard, učitavanje slobodnih slotova i uspešno zakazivanje. Testni korisnik i termin su zatim uklonjeni.</w:t>
       </w:r>
     </w:p>
     <w:sectPr>

</xml_diff>